<commit_message>
chore(templates): cập nhật Phôi bằng tốt nghiệp.docx
</commit_message>
<xml_diff>
--- a/templates/Phôi bằng tốt nghiệp.docx
+++ b/templates/Phôi bằng tốt nghiệp.docx
@@ -11,7 +11,14 @@
           <w:b/>
           <w:bCs/>
         </w:rPr>
-        <w:t>MẪU ĐỐI CHIẾU VĂN BẰNG TỐT NGHIỆP – BỐ TRÍ THEO PHÔI BẰNG (token)</w:t>
+        <w:t xml:space="preserve">                </w:t>
+      </w:r>
+      <w:r>
+        <w:rPr>
+          <w:b/>
+          <w:bCs/>
+        </w:rPr>
+        <w:t>MẪU ĐỐI CHIẾU VĂN BẰNG TỐT NGHIỆP – BỐ TRÍ THEO PHÔI BẰNG</w:t>
       </w:r>
     </w:p>
     <w:tbl>
@@ -31,7 +38,7 @@
       </w:tblGrid>
       <w:tr>
         <w:trPr>
-          <w:trHeight w:val="9315"/>
+          <w:trHeight w:val="7614"/>
           <w:jc w:val="center"/>
         </w:trPr>
         <w:tc>
@@ -625,7 +632,7 @@
                     <w:top w:val="nil"/>
                     <w:left w:val="nil"/>
                     <w:bottom w:val="nil"/>
-                    <w:right w:val="single" w:sz="4" w:space="0" w:color="auto"/>
+                    <w:right w:val="single" w:sz="4" w:space="0" w:color="D1D1D1" w:themeColor="background2" w:themeShade="E6"/>
                   </w:tcBorders>
                 </w:tcPr>
                 <w:p>
@@ -645,10 +652,10 @@
                 <w:tcPr>
                   <w:tcW w:w="4057" w:type="dxa"/>
                   <w:tcBorders>
-                    <w:top w:val="single" w:sz="4" w:space="0" w:color="auto"/>
-                    <w:left w:val="single" w:sz="4" w:space="0" w:color="auto"/>
-                    <w:bottom w:val="single" w:sz="4" w:space="0" w:color="auto"/>
-                    <w:right w:val="single" w:sz="4" w:space="0" w:color="auto"/>
+                    <w:top w:val="single" w:sz="4" w:space="0" w:color="D1D1D1" w:themeColor="background2" w:themeShade="E6"/>
+                    <w:left w:val="single" w:sz="4" w:space="0" w:color="D1D1D1" w:themeColor="background2" w:themeShade="E6"/>
+                    <w:bottom w:val="single" w:sz="4" w:space="0" w:color="D1D1D1" w:themeColor="background2" w:themeShade="E6"/>
+                    <w:right w:val="single" w:sz="4" w:space="0" w:color="D1D1D1" w:themeColor="background2" w:themeShade="E6"/>
                   </w:tcBorders>
                   <w:shd w:val="clear" w:color="auto" w:fill="D9E2F3"/>
                   <w:tcMar>
@@ -686,7 +693,7 @@
                     <w:top w:val="nil"/>
                     <w:left w:val="nil"/>
                     <w:bottom w:val="nil"/>
-                    <w:right w:val="single" w:sz="4" w:space="0" w:color="auto"/>
+                    <w:right w:val="single" w:sz="4" w:space="0" w:color="D1D1D1" w:themeColor="background2" w:themeShade="E6"/>
                   </w:tcBorders>
                 </w:tcPr>
                 <w:p>
@@ -704,10 +711,10 @@
                 <w:tcPr>
                   <w:tcW w:w="4057" w:type="dxa"/>
                   <w:tcBorders>
-                    <w:top w:val="single" w:sz="4" w:space="0" w:color="auto"/>
-                    <w:left w:val="single" w:sz="4" w:space="0" w:color="auto"/>
-                    <w:bottom w:val="single" w:sz="4" w:space="0" w:color="auto"/>
-                    <w:right w:val="single" w:sz="4" w:space="0" w:color="auto"/>
+                    <w:top w:val="single" w:sz="4" w:space="0" w:color="D1D1D1" w:themeColor="background2" w:themeShade="E6"/>
+                    <w:left w:val="single" w:sz="4" w:space="0" w:color="D1D1D1" w:themeColor="background2" w:themeShade="E6"/>
+                    <w:bottom w:val="single" w:sz="4" w:space="0" w:color="D1D1D1" w:themeColor="background2" w:themeShade="E6"/>
+                    <w:right w:val="single" w:sz="4" w:space="0" w:color="D1D1D1" w:themeColor="background2" w:themeShade="E6"/>
                   </w:tcBorders>
                   <w:tcMar>
                     <w:top w:w="26" w:type="dxa"/>
@@ -757,7 +764,7 @@
                     <w:top w:val="nil"/>
                     <w:left w:val="nil"/>
                     <w:bottom w:val="nil"/>
-                    <w:right w:val="single" w:sz="4" w:space="0" w:color="auto"/>
+                    <w:right w:val="single" w:sz="4" w:space="0" w:color="D1D1D1" w:themeColor="background2" w:themeShade="E6"/>
                   </w:tcBorders>
                 </w:tcPr>
                 <w:p>
@@ -775,10 +782,10 @@
                 <w:tcPr>
                   <w:tcW w:w="4057" w:type="dxa"/>
                   <w:tcBorders>
-                    <w:top w:val="single" w:sz="4" w:space="0" w:color="auto"/>
-                    <w:left w:val="single" w:sz="4" w:space="0" w:color="auto"/>
-                    <w:bottom w:val="single" w:sz="4" w:space="0" w:color="auto"/>
-                    <w:right w:val="single" w:sz="4" w:space="0" w:color="auto"/>
+                    <w:top w:val="single" w:sz="4" w:space="0" w:color="D1D1D1" w:themeColor="background2" w:themeShade="E6"/>
+                    <w:left w:val="single" w:sz="4" w:space="0" w:color="D1D1D1" w:themeColor="background2" w:themeShade="E6"/>
+                    <w:bottom w:val="single" w:sz="4" w:space="0" w:color="D1D1D1" w:themeColor="background2" w:themeShade="E6"/>
+                    <w:right w:val="single" w:sz="4" w:space="0" w:color="D1D1D1" w:themeColor="background2" w:themeShade="E6"/>
                   </w:tcBorders>
                   <w:tcMar>
                     <w:top w:w="26" w:type="dxa"/>
@@ -828,7 +835,7 @@
                     <w:top w:val="nil"/>
                     <w:left w:val="nil"/>
                     <w:bottom w:val="nil"/>
-                    <w:right w:val="single" w:sz="4" w:space="0" w:color="auto"/>
+                    <w:right w:val="single" w:sz="4" w:space="0" w:color="D1D1D1" w:themeColor="background2" w:themeShade="E6"/>
                   </w:tcBorders>
                 </w:tcPr>
                 <w:p>
@@ -846,10 +853,10 @@
                 <w:tcPr>
                   <w:tcW w:w="4057" w:type="dxa"/>
                   <w:tcBorders>
-                    <w:top w:val="single" w:sz="4" w:space="0" w:color="auto"/>
-                    <w:left w:val="single" w:sz="4" w:space="0" w:color="auto"/>
-                    <w:bottom w:val="single" w:sz="4" w:space="0" w:color="auto"/>
-                    <w:right w:val="single" w:sz="4" w:space="0" w:color="auto"/>
+                    <w:top w:val="single" w:sz="4" w:space="0" w:color="D1D1D1" w:themeColor="background2" w:themeShade="E6"/>
+                    <w:left w:val="single" w:sz="4" w:space="0" w:color="D1D1D1" w:themeColor="background2" w:themeShade="E6"/>
+                    <w:bottom w:val="single" w:sz="4" w:space="0" w:color="D1D1D1" w:themeColor="background2" w:themeShade="E6"/>
+                    <w:right w:val="single" w:sz="4" w:space="0" w:color="D1D1D1" w:themeColor="background2" w:themeShade="E6"/>
                   </w:tcBorders>
                   <w:tcMar>
                     <w:top w:w="26" w:type="dxa"/>
@@ -930,7 +937,7 @@
                     <w:top w:val="nil"/>
                     <w:left w:val="nil"/>
                     <w:bottom w:val="nil"/>
-                    <w:right w:val="single" w:sz="4" w:space="0" w:color="auto"/>
+                    <w:right w:val="single" w:sz="4" w:space="0" w:color="D1D1D1" w:themeColor="background2" w:themeShade="E6"/>
                   </w:tcBorders>
                 </w:tcPr>
                 <w:p>
@@ -948,10 +955,10 @@
                 <w:tcPr>
                   <w:tcW w:w="4057" w:type="dxa"/>
                   <w:tcBorders>
-                    <w:top w:val="single" w:sz="4" w:space="0" w:color="auto"/>
-                    <w:left w:val="single" w:sz="4" w:space="0" w:color="auto"/>
-                    <w:bottom w:val="single" w:sz="4" w:space="0" w:color="auto"/>
-                    <w:right w:val="single" w:sz="4" w:space="0" w:color="auto"/>
+                    <w:top w:val="single" w:sz="4" w:space="0" w:color="D1D1D1" w:themeColor="background2" w:themeShade="E6"/>
+                    <w:left w:val="single" w:sz="4" w:space="0" w:color="D1D1D1" w:themeColor="background2" w:themeShade="E6"/>
+                    <w:bottom w:val="single" w:sz="4" w:space="0" w:color="D1D1D1" w:themeColor="background2" w:themeShade="E6"/>
+                    <w:right w:val="single" w:sz="4" w:space="0" w:color="D1D1D1" w:themeColor="background2" w:themeShade="E6"/>
                   </w:tcBorders>
                   <w:tcMar>
                     <w:top w:w="26" w:type="dxa"/>
@@ -1001,7 +1008,7 @@
                     <w:top w:val="nil"/>
                     <w:left w:val="nil"/>
                     <w:bottom w:val="nil"/>
-                    <w:right w:val="single" w:sz="4" w:space="0" w:color="auto"/>
+                    <w:right w:val="single" w:sz="4" w:space="0" w:color="D1D1D1" w:themeColor="background2" w:themeShade="E6"/>
                   </w:tcBorders>
                 </w:tcPr>
                 <w:p>
@@ -1019,10 +1026,10 @@
                 <w:tcPr>
                   <w:tcW w:w="4057" w:type="dxa"/>
                   <w:tcBorders>
-                    <w:top w:val="single" w:sz="4" w:space="0" w:color="auto"/>
-                    <w:left w:val="single" w:sz="4" w:space="0" w:color="auto"/>
-                    <w:bottom w:val="single" w:sz="4" w:space="0" w:color="auto"/>
-                    <w:right w:val="single" w:sz="4" w:space="0" w:color="auto"/>
+                    <w:top w:val="single" w:sz="4" w:space="0" w:color="D1D1D1" w:themeColor="background2" w:themeShade="E6"/>
+                    <w:left w:val="single" w:sz="4" w:space="0" w:color="D1D1D1" w:themeColor="background2" w:themeShade="E6"/>
+                    <w:bottom w:val="single" w:sz="4" w:space="0" w:color="D1D1D1" w:themeColor="background2" w:themeShade="E6"/>
+                    <w:right w:val="single" w:sz="4" w:space="0" w:color="D1D1D1" w:themeColor="background2" w:themeShade="E6"/>
                   </w:tcBorders>
                   <w:tcMar>
                     <w:top w:w="26" w:type="dxa"/>
@@ -1092,7 +1099,7 @@
                     <w:top w:val="nil"/>
                     <w:left w:val="nil"/>
                     <w:bottom w:val="nil"/>
-                    <w:right w:val="single" w:sz="4" w:space="0" w:color="auto"/>
+                    <w:right w:val="single" w:sz="4" w:space="0" w:color="D1D1D1" w:themeColor="background2" w:themeShade="E6"/>
                   </w:tcBorders>
                 </w:tcPr>
                 <w:p>
@@ -1110,10 +1117,10 @@
                 <w:tcPr>
                   <w:tcW w:w="4057" w:type="dxa"/>
                   <w:tcBorders>
-                    <w:top w:val="single" w:sz="4" w:space="0" w:color="auto"/>
-                    <w:left w:val="single" w:sz="4" w:space="0" w:color="auto"/>
-                    <w:bottom w:val="single" w:sz="4" w:space="0" w:color="auto"/>
-                    <w:right w:val="single" w:sz="4" w:space="0" w:color="auto"/>
+                    <w:top w:val="single" w:sz="4" w:space="0" w:color="D1D1D1" w:themeColor="background2" w:themeShade="E6"/>
+                    <w:left w:val="single" w:sz="4" w:space="0" w:color="D1D1D1" w:themeColor="background2" w:themeShade="E6"/>
+                    <w:bottom w:val="single" w:sz="4" w:space="0" w:color="D1D1D1" w:themeColor="background2" w:themeShade="E6"/>
+                    <w:right w:val="single" w:sz="4" w:space="0" w:color="D1D1D1" w:themeColor="background2" w:themeShade="E6"/>
                   </w:tcBorders>
                   <w:tcMar>
                     <w:top w:w="26" w:type="dxa"/>
@@ -1163,7 +1170,7 @@
                     <w:top w:val="nil"/>
                     <w:left w:val="nil"/>
                     <w:bottom w:val="nil"/>
-                    <w:right w:val="single" w:sz="4" w:space="0" w:color="auto"/>
+                    <w:right w:val="single" w:sz="4" w:space="0" w:color="D1D1D1" w:themeColor="background2" w:themeShade="E6"/>
                   </w:tcBorders>
                 </w:tcPr>
                 <w:p>
@@ -1181,10 +1188,10 @@
                 <w:tcPr>
                   <w:tcW w:w="4057" w:type="dxa"/>
                   <w:tcBorders>
-                    <w:top w:val="single" w:sz="4" w:space="0" w:color="auto"/>
-                    <w:left w:val="single" w:sz="4" w:space="0" w:color="auto"/>
-                    <w:bottom w:val="single" w:sz="4" w:space="0" w:color="auto"/>
-                    <w:right w:val="single" w:sz="4" w:space="0" w:color="auto"/>
+                    <w:top w:val="single" w:sz="4" w:space="0" w:color="D1D1D1" w:themeColor="background2" w:themeShade="E6"/>
+                    <w:left w:val="single" w:sz="4" w:space="0" w:color="D1D1D1" w:themeColor="background2" w:themeShade="E6"/>
+                    <w:bottom w:val="single" w:sz="4" w:space="0" w:color="D1D1D1" w:themeColor="background2" w:themeShade="E6"/>
+                    <w:right w:val="single" w:sz="4" w:space="0" w:color="D1D1D1" w:themeColor="background2" w:themeShade="E6"/>
                   </w:tcBorders>
                   <w:tcMar>
                     <w:top w:w="26" w:type="dxa"/>
@@ -1249,7 +1256,7 @@
                     <w:top w:val="nil"/>
                     <w:left w:val="nil"/>
                     <w:bottom w:val="nil"/>
-                    <w:right w:val="single" w:sz="4" w:space="0" w:color="auto"/>
+                    <w:right w:val="single" w:sz="4" w:space="0" w:color="D1D1D1" w:themeColor="background2" w:themeShade="E6"/>
                   </w:tcBorders>
                 </w:tcPr>
                 <w:p>
@@ -1267,10 +1274,10 @@
                 <w:tcPr>
                   <w:tcW w:w="4057" w:type="dxa"/>
                   <w:tcBorders>
-                    <w:top w:val="single" w:sz="4" w:space="0" w:color="auto"/>
-                    <w:left w:val="single" w:sz="4" w:space="0" w:color="auto"/>
-                    <w:bottom w:val="single" w:sz="4" w:space="0" w:color="auto"/>
-                    <w:right w:val="single" w:sz="4" w:space="0" w:color="auto"/>
+                    <w:top w:val="single" w:sz="4" w:space="0" w:color="D1D1D1" w:themeColor="background2" w:themeShade="E6"/>
+                    <w:left w:val="single" w:sz="4" w:space="0" w:color="D1D1D1" w:themeColor="background2" w:themeShade="E6"/>
+                    <w:bottom w:val="single" w:sz="4" w:space="0" w:color="D1D1D1" w:themeColor="background2" w:themeShade="E6"/>
+                    <w:right w:val="single" w:sz="4" w:space="0" w:color="D1D1D1" w:themeColor="background2" w:themeShade="E6"/>
                   </w:tcBorders>
                   <w:tcMar>
                     <w:top w:w="26" w:type="dxa"/>
@@ -1320,7 +1327,7 @@
                     <w:top w:val="nil"/>
                     <w:left w:val="nil"/>
                     <w:bottom w:val="nil"/>
-                    <w:right w:val="single" w:sz="4" w:space="0" w:color="auto"/>
+                    <w:right w:val="single" w:sz="4" w:space="0" w:color="D1D1D1" w:themeColor="background2" w:themeShade="E6"/>
                   </w:tcBorders>
                 </w:tcPr>
                 <w:p>
@@ -1338,10 +1345,10 @@
                 <w:tcPr>
                   <w:tcW w:w="4057" w:type="dxa"/>
                   <w:tcBorders>
-                    <w:top w:val="single" w:sz="4" w:space="0" w:color="auto"/>
-                    <w:left w:val="single" w:sz="4" w:space="0" w:color="auto"/>
-                    <w:bottom w:val="single" w:sz="4" w:space="0" w:color="auto"/>
-                    <w:right w:val="single" w:sz="4" w:space="0" w:color="auto"/>
+                    <w:top w:val="single" w:sz="4" w:space="0" w:color="D1D1D1" w:themeColor="background2" w:themeShade="E6"/>
+                    <w:left w:val="single" w:sz="4" w:space="0" w:color="D1D1D1" w:themeColor="background2" w:themeShade="E6"/>
+                    <w:bottom w:val="single" w:sz="4" w:space="0" w:color="D1D1D1" w:themeColor="background2" w:themeShade="E6"/>
+                    <w:right w:val="single" w:sz="4" w:space="0" w:color="D1D1D1" w:themeColor="background2" w:themeShade="E6"/>
                   </w:tcBorders>
                   <w:tcMar>
                     <w:top w:w="26" w:type="dxa"/>
@@ -1391,7 +1398,7 @@
                     <w:top w:val="nil"/>
                     <w:left w:val="nil"/>
                     <w:bottom w:val="nil"/>
-                    <w:right w:val="single" w:sz="4" w:space="0" w:color="auto"/>
+                    <w:right w:val="single" w:sz="4" w:space="0" w:color="D1D1D1" w:themeColor="background2" w:themeShade="E6"/>
                   </w:tcBorders>
                 </w:tcPr>
                 <w:p>
@@ -1409,10 +1416,10 @@
                 <w:tcPr>
                   <w:tcW w:w="4057" w:type="dxa"/>
                   <w:tcBorders>
-                    <w:top w:val="single" w:sz="4" w:space="0" w:color="auto"/>
-                    <w:left w:val="single" w:sz="4" w:space="0" w:color="auto"/>
-                    <w:bottom w:val="single" w:sz="4" w:space="0" w:color="auto"/>
-                    <w:right w:val="single" w:sz="4" w:space="0" w:color="auto"/>
+                    <w:top w:val="single" w:sz="4" w:space="0" w:color="D1D1D1" w:themeColor="background2" w:themeShade="E6"/>
+                    <w:left w:val="single" w:sz="4" w:space="0" w:color="D1D1D1" w:themeColor="background2" w:themeShade="E6"/>
+                    <w:bottom w:val="single" w:sz="4" w:space="0" w:color="D1D1D1" w:themeColor="background2" w:themeShade="E6"/>
+                    <w:right w:val="single" w:sz="4" w:space="0" w:color="D1D1D1" w:themeColor="background2" w:themeShade="E6"/>
                   </w:tcBorders>
                   <w:tcMar>
                     <w:top w:w="26" w:type="dxa"/>
@@ -1462,7 +1469,7 @@
                     <w:top w:val="nil"/>
                     <w:left w:val="nil"/>
                     <w:bottom w:val="nil"/>
-                    <w:right w:val="single" w:sz="4" w:space="0" w:color="auto"/>
+                    <w:right w:val="single" w:sz="4" w:space="0" w:color="D1D1D1" w:themeColor="background2" w:themeShade="E6"/>
                   </w:tcBorders>
                 </w:tcPr>
                 <w:p>
@@ -1480,10 +1487,10 @@
                 <w:tcPr>
                   <w:tcW w:w="4057" w:type="dxa"/>
                   <w:tcBorders>
-                    <w:top w:val="single" w:sz="4" w:space="0" w:color="auto"/>
-                    <w:left w:val="single" w:sz="4" w:space="0" w:color="auto"/>
-                    <w:bottom w:val="single" w:sz="4" w:space="0" w:color="auto"/>
-                    <w:right w:val="single" w:sz="4" w:space="0" w:color="auto"/>
+                    <w:top w:val="single" w:sz="4" w:space="0" w:color="D1D1D1" w:themeColor="background2" w:themeShade="E6"/>
+                    <w:left w:val="single" w:sz="4" w:space="0" w:color="D1D1D1" w:themeColor="background2" w:themeShade="E6"/>
+                    <w:bottom w:val="single" w:sz="4" w:space="0" w:color="D1D1D1" w:themeColor="background2" w:themeShade="E6"/>
+                    <w:right w:val="single" w:sz="4" w:space="0" w:color="D1D1D1" w:themeColor="background2" w:themeShade="E6"/>
                   </w:tcBorders>
                   <w:tcMar>
                     <w:top w:w="26" w:type="dxa"/>
@@ -1548,7 +1555,7 @@
                     <w:top w:val="nil"/>
                     <w:left w:val="nil"/>
                     <w:bottom w:val="nil"/>
-                    <w:right w:val="single" w:sz="4" w:space="0" w:color="auto"/>
+                    <w:right w:val="single" w:sz="4" w:space="0" w:color="D1D1D1" w:themeColor="background2" w:themeShade="E6"/>
                   </w:tcBorders>
                 </w:tcPr>
                 <w:p>
@@ -1566,10 +1573,10 @@
                 <w:tcPr>
                   <w:tcW w:w="4057" w:type="dxa"/>
                   <w:tcBorders>
-                    <w:top w:val="single" w:sz="4" w:space="0" w:color="auto"/>
-                    <w:left w:val="single" w:sz="4" w:space="0" w:color="auto"/>
-                    <w:bottom w:val="single" w:sz="4" w:space="0" w:color="auto"/>
-                    <w:right w:val="single" w:sz="4" w:space="0" w:color="auto"/>
+                    <w:top w:val="single" w:sz="4" w:space="0" w:color="D1D1D1" w:themeColor="background2" w:themeShade="E6"/>
+                    <w:left w:val="single" w:sz="4" w:space="0" w:color="D1D1D1" w:themeColor="background2" w:themeShade="E6"/>
+                    <w:bottom w:val="single" w:sz="4" w:space="0" w:color="D1D1D1" w:themeColor="background2" w:themeShade="E6"/>
+                    <w:right w:val="single" w:sz="4" w:space="0" w:color="D1D1D1" w:themeColor="background2" w:themeShade="E6"/>
                   </w:tcBorders>
                   <w:tcMar>
                     <w:top w:w="26" w:type="dxa"/>
@@ -1640,7 +1647,7 @@
                     <w:top w:val="nil"/>
                     <w:left w:val="nil"/>
                     <w:bottom w:val="nil"/>
-                    <w:right w:val="single" w:sz="4" w:space="0" w:color="auto"/>
+                    <w:right w:val="single" w:sz="4" w:space="0" w:color="D1D1D1" w:themeColor="background2" w:themeShade="E6"/>
                   </w:tcBorders>
                 </w:tcPr>
                 <w:p>
@@ -1658,10 +1665,10 @@
                 <w:tcPr>
                   <w:tcW w:w="4057" w:type="dxa"/>
                   <w:tcBorders>
-                    <w:top w:val="single" w:sz="4" w:space="0" w:color="auto"/>
-                    <w:left w:val="single" w:sz="4" w:space="0" w:color="auto"/>
-                    <w:bottom w:val="single" w:sz="4" w:space="0" w:color="auto"/>
-                    <w:right w:val="single" w:sz="4" w:space="0" w:color="auto"/>
+                    <w:top w:val="single" w:sz="4" w:space="0" w:color="D1D1D1" w:themeColor="background2" w:themeShade="E6"/>
+                    <w:left w:val="single" w:sz="4" w:space="0" w:color="D1D1D1" w:themeColor="background2" w:themeShade="E6"/>
+                    <w:bottom w:val="single" w:sz="4" w:space="0" w:color="D1D1D1" w:themeColor="background2" w:themeShade="E6"/>
+                    <w:right w:val="single" w:sz="4" w:space="0" w:color="D1D1D1" w:themeColor="background2" w:themeShade="E6"/>
                   </w:tcBorders>
                   <w:tcMar>
                     <w:top w:w="26" w:type="dxa"/>
@@ -1729,7 +1736,7 @@
                     <w:top w:val="nil"/>
                     <w:left w:val="nil"/>
                     <w:bottom w:val="nil"/>
-                    <w:right w:val="single" w:sz="4" w:space="0" w:color="auto"/>
+                    <w:right w:val="single" w:sz="4" w:space="0" w:color="D1D1D1" w:themeColor="background2" w:themeShade="E6"/>
                   </w:tcBorders>
                 </w:tcPr>
                 <w:p>
@@ -1747,10 +1754,10 @@
                 <w:tcPr>
                   <w:tcW w:w="4057" w:type="dxa"/>
                   <w:tcBorders>
-                    <w:top w:val="single" w:sz="4" w:space="0" w:color="auto"/>
-                    <w:left w:val="single" w:sz="4" w:space="0" w:color="auto"/>
-                    <w:bottom w:val="single" w:sz="4" w:space="0" w:color="auto"/>
-                    <w:right w:val="single" w:sz="4" w:space="0" w:color="auto"/>
+                    <w:top w:val="single" w:sz="4" w:space="0" w:color="D1D1D1" w:themeColor="background2" w:themeShade="E6"/>
+                    <w:left w:val="single" w:sz="4" w:space="0" w:color="D1D1D1" w:themeColor="background2" w:themeShade="E6"/>
+                    <w:bottom w:val="single" w:sz="4" w:space="0" w:color="D1D1D1" w:themeColor="background2" w:themeShade="E6"/>
+                    <w:right w:val="single" w:sz="4" w:space="0" w:color="D1D1D1" w:themeColor="background2" w:themeShade="E6"/>
                   </w:tcBorders>
                   <w:tcMar>
                     <w:top w:w="26" w:type="dxa"/>
@@ -1925,7 +1932,7 @@
         <w:rFonts w:ascii="Times New Roman" w:eastAsia="Times New Roman" w:hAnsi="Times New Roman" w:cs="Times New Roman"/>
         <w:sz w:val="24"/>
         <w:szCs w:val="24"/>
-        <w:lang w:eastAsia="en-US" w:bidi="ar-SA"/>
+        <w:lang w:val="en-VN" w:eastAsia="en-US" w:bidi="ar-SA"/>
       </w:rPr>
     </w:rPrDefault>
     <w:pPrDefault/>

</xml_diff>